<commit_message>
Report: corrected docx and PDF
</commit_message>
<xml_diff>
--- a/report/CTE412_Practical15_Lab_Report_02230153.docx
+++ b/report/CTE412_Practical15_Lab_Report_02230153.docx
@@ -860,14 +860,12 @@
             <w:r>
               <w:rPr>
                 <w:rFonts w:ascii="Calibri" w:cs="Calibri" w:eastAsia="Calibri" w:hAnsi="Calibri"/>
-                <w:b/>
-                <w:bCs/>
-                <w:sz w:val="19"/>
-                <w:szCs w:val="19"/>
-                <w:highlight w:val="yellow"/>
-                <w:highlightCs w:val="yellow"/>
-              </w:rPr>
-              <w:t xml:space="preserve">[FILL from docker version]</w:t>
+                <w:b w:val="false"/>
+                <w:bCs w:val="false"/>
+                <w:sz w:val="19"/>
+                <w:szCs w:val="19"/>
+              </w:rPr>
+              <w:t xml:space="preserve">29.8.2 (build 7fc2dff)</w:t>
             </w:r>
           </w:p>
         </w:tc>
@@ -938,7 +936,7 @@
                 <w:sz w:val="19"/>
                 <w:szCs w:val="19"/>
               </w:rPr>
-              <w:t xml:space="preserve">kind.exe from C:\kind (version: see evidence); node image kindest/node:v1.37.0, containerd 2.3.4 (t1-nodes-wide.txt)</w:t>
+              <w:t xml:space="preserve">kind.exe from C:\kind (version 0.33.0); node image kindest/node:v1.37.0, containerd 2.3.4 (t1-nodes-wide.txt)</w:t>
             </w:r>
           </w:p>
         </w:tc>
@@ -1775,7 +1773,7 @@
                 <w:highlight w:val="yellow"/>
                 <w:highlightCs w:val="yellow"/>
               </w:rPr>
-              <w:t xml:space="preserve">[FILL from t5-rolling-window.txt]</w:t>
+              <w:t>37 (first 1.1.0 at 10:39:05Z, last 1.0.0 at 10:39:42Z)</w:t>
             </w:r>
           </w:p>
         </w:tc>
@@ -3897,7 +3895,7 @@
                 <w:highlight w:val="yellow"/>
                 <w:highlightCs w:val="yellow"/>
               </w:rPr>
-              <w:t xml:space="preserve">[FILL from t5-rolling-window.txt] s</w:t>
+              <w:t>37 s</w:t>
             </w:r>
           </w:p>
           <w:p>
@@ -5679,6 +5677,67 @@
           <w:szCs w:val="18"/>
         </w:rPr>
         <w:t xml:space="preserve">Figure 19 (E9.2): context reset to default and cluster cte412-02230153 deleted.</w:t>
+      </w:r>
+    </w:p>
+    <w:p>
+      <w:pPr>
+        <w:keepNext/>
+        <w:spacing w:after="40" w:before="120"/>
+        <w:jc w:val="center"/>
+      </w:pPr>
+      <w:r>
+        <w:drawing>
+          <wp:inline distT="0" distB="0" distL="0" distR="0">
+            <wp:extent cx="5334000" cy="3329234"/>
+            <wp:effectExtent t="0" r="0" b="0" l="0"/>
+            <wp:docPr id="2" name="fig20" descr="Figure 20 (repository): git history of the repository, 18 commits made during the lab session, one or more per task (git log --oneline)." title="Figure 20 (repository): git history of the repository, 18 commits made during the lab session, one or more per task (git log --oneline)."/>
+            <wp:cNvGraphicFramePr>
+              <a:graphicFrameLocks xmlns:a="http://schemas.openxmlformats.org/drawingml/2006/main" noChangeAspect="1"/>
+            </wp:cNvGraphicFramePr>
+            <a:graphic xmlns:a="http://schemas.openxmlformats.org/drawingml/2006/main">
+              <a:graphicData uri="http://schemas.openxmlformats.org/drawingml/2006/picture">
+                <pic:pic xmlns:pic="http://schemas.openxmlformats.org/drawingml/2006/picture">
+                  <pic:nvPicPr>
+                    <pic:cNvPr id="0" name="commit-history.png" descr=""/>
+                    <pic:cNvPicPr/>
+                  </pic:nvPicPr>
+                  <pic:blipFill>
+                    <a:blip r:embed="rId29"/>
+                    <a:stretch>
+                      <a:fillRect/>
+                    </a:stretch>
+                  </pic:blipFill>
+                  <pic:spPr>
+                    <a:xfrm>
+                      <a:off x="0" y="0"/>
+                      <a:ext cx="5334000" cy="3329234"/>
+                    </a:xfrm>
+                    <a:prstGeom prst="rect">
+                      <a:avLst/>
+                    </a:prstGeom>
+                  </pic:spPr>
+                </pic:pic>
+              </a:graphicData>
+            </a:graphic>
+          </wp:inline>
+        </w:drawing>
+      </w:r>
+    </w:p>
+    <w:p>
+      <w:pPr>
+        <w:spacing w:after="160"/>
+        <w:jc w:val="center"/>
+      </w:pPr>
+      <w:r>
+        <w:rPr>
+          <w:rFonts w:ascii="Calibri" w:cs="Calibri" w:eastAsia="Calibri" w:hAnsi="Calibri"/>
+          <w:i/>
+          <w:iCs/>
+          <w:color w:val="444444"/>
+          <w:sz w:val="18"/>
+          <w:szCs w:val="18"/>
+        </w:rPr>
+        <w:t xml:space="preserve">Figure 20 (repository): git history of the repository, 18 commits made during the lab session, one or more per task (git log --oneline).</w:t>
       </w:r>
     </w:p>
     <w:sectPr>

</xml_diff>